<commit_message>
feat: add DontTrust project, open source contributions section, updated resume, and new favicon
</commit_message>
<xml_diff>
--- a/Abhishek_M_R_Resume.docx
+++ b/Abhishek_M_R_Resume.docx
@@ -4,21 +4,21 @@
   <w:body>
     <w:p>
       <w:pPr>
-        <w:spacing w:before="0" w:after="30"/>
+        <w:spacing w:before="0" w:after="20"/>
         <w:jc w:val="center"/>
       </w:pPr>
       <w:r>
         <w:rPr>
           <w:b/>
           <w:color w:val="0D1424"/>
-          <w:sz w:val="30"/>
+          <w:sz w:val="28"/>
         </w:rPr>
         <w:t>ABHISHEK M R</w:t>
         <w:br/>
       </w:r>
       <w:r>
         <w:rPr>
-          <w:sz w:val="17"/>
+          <w:sz w:val="16"/>
         </w:rPr>
         <w:t>Bengaluru, India | +91 7259371549 | mrabhisheak@gmail.com</w:t>
         <w:br/>
@@ -26,14 +26,14 @@
       <w:r>
         <w:rPr>
           <w:color w:val="102A6B"/>
-          <w:sz w:val="17"/>
+          <w:sz w:val="16"/>
         </w:rPr>
         <w:t>Portfolio: abhishekmr.vercel.app | GitHub: github.com/abhi-byte62 | LinkedIn: in/abhishekmr029 | LeetCode: u/playboldAbhi</w:t>
       </w:r>
     </w:p>
     <w:p>
       <w:pPr>
-        <w:spacing w:before="70" w:after="30" w:line="240" w:lineRule="auto"/>
+        <w:spacing w:before="60" w:after="24" w:line="240" w:lineRule="auto"/>
         <w:pBdr>
           <w:bottom w:val="single" w:sz="4" w:space="1" w:color="CBD5E0"/>
         </w:pBdr>
@@ -43,25 +43,25 @@
           <w:rFonts w:ascii="Calibri" w:hAnsi="Calibri"/>
           <w:b/>
           <w:color w:val="0D1424"/>
-          <w:sz w:val="20"/>
+          <w:sz w:val="19"/>
         </w:rPr>
         <w:t>PROFESSIONAL SUMMARY</w:t>
       </w:r>
     </w:p>
     <w:p>
       <w:pPr>
-        <w:spacing w:before="30" w:after="60" w:line="252" w:lineRule="auto"/>
+        <w:spacing w:before="20" w:after="40" w:line="252" w:lineRule="auto"/>
       </w:pPr>
       <w:r>
         <w:rPr>
-          <w:sz w:val="17"/>
+          <w:sz w:val="16"/>
         </w:rPr>
-        <w:t>Software Engineer with a strong Computer Science foundation specializing in backend architectures, distributed systems, and low-latency C++/Java applications. Experienced in developing deterministic limit order book matching engines, event-driven microservices with RabbitMQ, stream backpressure pipelines, and optimistic concurrency control systems. Proficient in Data Structures, Algorithms, System Design, and building verified, high-throughput software.</w:t>
+        <w:t>Software Engineer specializing in backend architectures, distributed systems, application security platforms, and low-latency C++/Java applications. Upstream contributor to Tier-1 open-source systems (Valkey, Fastify, QuantConnect Lean, QuickFIX). Experienced in building AST data-flow analyzers, deterministic order book matching engines, event-driven microservices with RabbitMQ, and stream backpressure pipelines.</w:t>
       </w:r>
     </w:p>
     <w:p>
       <w:pPr>
-        <w:spacing w:before="70" w:after="30" w:line="240" w:lineRule="auto"/>
+        <w:spacing w:before="60" w:after="24" w:line="240" w:lineRule="auto"/>
         <w:pBdr>
           <w:bottom w:val="single" w:sz="4" w:space="1" w:color="CBD5E0"/>
         </w:pBdr>
@@ -71,122 +71,122 @@
           <w:rFonts w:ascii="Calibri" w:hAnsi="Calibri"/>
           <w:b/>
           <w:color w:val="0D1424"/>
-          <w:sz w:val="20"/>
+          <w:sz w:val="19"/>
         </w:rPr>
         <w:t>TECHNICAL SKILLS</w:t>
       </w:r>
     </w:p>
     <w:p>
       <w:pPr>
-        <w:spacing w:before="0" w:after="20" w:line="240" w:lineRule="auto"/>
+        <w:spacing w:before="0" w:after="16" w:line="240" w:lineRule="auto"/>
       </w:pPr>
       <w:r>
         <w:rPr>
           <w:b/>
-          <w:sz w:val="17"/>
+          <w:sz w:val="16"/>
         </w:rPr>
         <w:t xml:space="preserve">• Languages: </w:t>
       </w:r>
       <w:r>
         <w:rPr>
-          <w:sz w:val="17"/>
+          <w:sz w:val="16"/>
         </w:rPr>
-        <w:t>C++17, Java 21, JavaScript (ES6+), TypeScript, Python 3, C, SQL</w:t>
+        <w:t>C++17, Java 21, JavaScript (ES6+), TypeScript, Python 3, C, C#, SQL</w:t>
       </w:r>
     </w:p>
     <w:p>
       <w:pPr>
-        <w:spacing w:before="0" w:after="20" w:line="240" w:lineRule="auto"/>
+        <w:spacing w:before="0" w:after="16" w:line="240" w:lineRule="auto"/>
       </w:pPr>
       <w:r>
         <w:rPr>
           <w:b/>
-          <w:sz w:val="17"/>
+          <w:sz w:val="16"/>
         </w:rPr>
         <w:t xml:space="preserve">• Backend &amp; Distributed: </w:t>
       </w:r>
       <w:r>
         <w:rPr>
-          <w:sz w:val="17"/>
+          <w:sz w:val="16"/>
         </w:rPr>
         <w:t>Spring Boot 3, Node.js, Express, FastAPI, RabbitMQ, WebSockets, RESTful APIs</w:t>
       </w:r>
     </w:p>
     <w:p>
       <w:pPr>
-        <w:spacing w:before="0" w:after="20" w:line="240" w:lineRule="auto"/>
+        <w:spacing w:before="0" w:after="16" w:line="240" w:lineRule="auto"/>
       </w:pPr>
       <w:r>
         <w:rPr>
           <w:b/>
-          <w:sz w:val="17"/>
+          <w:sz w:val="16"/>
         </w:rPr>
-        <w:t xml:space="preserve">• Databases &amp; Caching: </w:t>
+        <w:t xml:space="preserve">• Databases &amp; Storage: </w:t>
       </w:r>
       <w:r>
         <w:rPr>
-          <w:sz w:val="17"/>
+          <w:sz w:val="16"/>
         </w:rPr>
-        <w:t>PostgreSQL 16/17, MySQL, Redis 7 (Pub/Sub &amp; Caching), Prisma ORM</w:t>
+        <w:t>PostgreSQL 16/17, MySQL, Redis 7 / Valkey (Pub/Sub &amp; Caching), Prisma ORM</w:t>
       </w:r>
     </w:p>
     <w:p>
       <w:pPr>
-        <w:spacing w:before="0" w:after="20" w:line="240" w:lineRule="auto"/>
+        <w:spacing w:before="0" w:after="16" w:line="240" w:lineRule="auto"/>
       </w:pPr>
       <w:r>
         <w:rPr>
           <w:b/>
-          <w:sz w:val="17"/>
+          <w:sz w:val="16"/>
         </w:rPr>
-        <w:t xml:space="preserve">• Systems &amp; Architecture: </w:t>
+        <w:t xml:space="preserve">• Systems &amp; Security: </w:t>
       </w:r>
       <w:r>
         <w:rPr>
-          <w:sz w:val="17"/>
+          <w:sz w:val="16"/>
         </w:rPr>
-        <w:t>Limit Order Books (LOB), Fixed-Point Math, Stream Backpressure, Concurrency, Zero-Copy Buffers, WebGL</w:t>
+        <w:t>AST Analysis, Source-to-Sink Tracking, SARIF, Limit Order Books, Fixed-Point Math, Stream Backpressure, OCC</w:t>
       </w:r>
     </w:p>
     <w:p>
       <w:pPr>
-        <w:spacing w:before="0" w:after="20" w:line="240" w:lineRule="auto"/>
+        <w:spacing w:before="0" w:after="16" w:line="240" w:lineRule="auto"/>
       </w:pPr>
       <w:r>
         <w:rPr>
           <w:b/>
-          <w:sz w:val="17"/>
+          <w:sz w:val="16"/>
         </w:rPr>
         <w:t xml:space="preserve">• Infrastructure &amp; Tools: </w:t>
       </w:r>
       <w:r>
         <w:rPr>
-          <w:sz w:val="17"/>
+          <w:sz w:val="16"/>
         </w:rPr>
-        <w:t>Docker &amp; Compose, Git, GitHub Actions, Linux / POSIX Shell, Postman, Vitest</w:t>
+        <w:t>Docker &amp; Compose, Git, GitHub Actions, Linux / POSIX Shell, Vitest, Playwright, Cytoscape.js</w:t>
       </w:r>
     </w:p>
     <w:p>
       <w:pPr>
-        <w:spacing w:before="0" w:after="20" w:line="240" w:lineRule="auto"/>
+        <w:spacing w:before="0" w:after="16" w:line="240" w:lineRule="auto"/>
       </w:pPr>
       <w:r>
         <w:rPr>
           <w:b/>
-          <w:sz w:val="17"/>
+          <w:sz w:val="16"/>
         </w:rPr>
         <w:t xml:space="preserve">• Core CS Foundations: </w:t>
       </w:r>
       <w:r>
         <w:rPr>
-          <w:sz w:val="17"/>
+          <w:sz w:val="16"/>
         </w:rPr>
-        <w:t>Data Structures &amp; Algorithms, OOP, OS (Memory, I/O), DBMS, Computer Networks, System Design, OCC</w:t>
+        <w:t>Data Structures &amp; Algorithms, OOP, OS (Memory, I/O), DBMS, Computer Networks, System Design</w:t>
       </w:r>
     </w:p>
     <w:p>
       <w:pPr>
-        <w:spacing w:before="70" w:after="30" w:line="240" w:lineRule="auto"/>
+        <w:spacing w:before="60" w:after="24" w:line="240" w:lineRule="auto"/>
         <w:pBdr>
           <w:bottom w:val="single" w:sz="4" w:space="1" w:color="CBD5E0"/>
         </w:pBdr>
@@ -196,26 +196,223 @@
           <w:rFonts w:ascii="Calibri" w:hAnsi="Calibri"/>
           <w:b/>
           <w:color w:val="0D1424"/>
-          <w:sz w:val="20"/>
+          <w:sz w:val="19"/>
+        </w:rPr>
+        <w:t>UPSTREAM OPEN SOURCE CONTRIBUTIONS</w:t>
+      </w:r>
+    </w:p>
+    <w:p>
+      <w:pPr>
+        <w:spacing w:before="36" w:after="10" w:line="240" w:lineRule="auto"/>
+      </w:pPr>
+      <w:r>
+        <w:rPr>
+          <w:b/>
+          <w:sz w:val="16"/>
+        </w:rPr>
+        <w:t>Valkey — Linux Foundation Key-Value Datastore (Redis Fork)</w:t>
+      </w:r>
+      <w:r>
+        <w:rPr>
+          <w:i/>
+          <w:sz w:val="15"/>
+        </w:rPr>
+        <w:t xml:space="preserve"> | C, Systems &amp; Storage Internals</w:t>
+        <w:br/>
+      </w:r>
+      <w:r>
+        <w:rPr>
+          <w:color w:val="102A6B"/>
+          <w:sz w:val="15"/>
+        </w:rPr>
+        <w:t>[GitHub: valkey-io/valkey]</w:t>
+      </w:r>
+    </w:p>
+    <w:p>
+      <w:pPr>
+        <w:spacing w:before="0" w:after="10" w:line="240" w:lineRule="auto"/>
+        <w:ind w:left="216"/>
+      </w:pPr>
+      <w:r>
+        <w:rPr>
+          <w:sz w:val="16"/>
+        </w:rPr>
+        <w:t>• Resolved stream trimming integer overflow when MAXLEN ≥ 2^32 on 32-bit builds in t_stream.c; removed static compression buffer in RDB serialization to eliminate re-entrancy hazards; refactored key eviction core.</w:t>
+      </w:r>
+    </w:p>
+    <w:p>
+      <w:pPr>
+        <w:spacing w:before="36" w:after="10" w:line="240" w:lineRule="auto"/>
+      </w:pPr>
+      <w:r>
+        <w:rPr>
+          <w:b/>
+          <w:sz w:val="16"/>
+        </w:rPr>
+        <w:t>Fastify Ecosystem (fastify-typebox, fastify-swagger, ajv-compiler)</w:t>
+      </w:r>
+      <w:r>
+        <w:rPr>
+          <w:i/>
+          <w:sz w:val="15"/>
+        </w:rPr>
+        <w:t xml:space="preserve"> | TypeScript, Web Framework Runtime</w:t>
+        <w:br/>
+      </w:r>
+      <w:r>
+        <w:rPr>
+          <w:color w:val="102A6B"/>
+          <w:sz w:val="15"/>
+        </w:rPr>
+        <w:t>[GitHub: github.com/fastify]</w:t>
+      </w:r>
+    </w:p>
+    <w:p>
+      <w:pPr>
+        <w:spacing w:before="0" w:after="10" w:line="240" w:lineRule="auto"/>
+        <w:ind w:left="216"/>
+      </w:pPr>
+      <w:r>
+        <w:rPr>
+          <w:sz w:val="16"/>
+        </w:rPr>
+        <w:t>• Implemented schema $ref reference resolution in TypeBox validator compiler; added OpenAPI 3.x path parameter serialization support; updated route validator/serializer compiler TypeScript definitions.</w:t>
+      </w:r>
+    </w:p>
+    <w:p>
+      <w:pPr>
+        <w:spacing w:before="36" w:after="10" w:line="240" w:lineRule="auto"/>
+      </w:pPr>
+      <w:r>
+        <w:rPr>
+          <w:b/>
+          <w:sz w:val="16"/>
+        </w:rPr>
+        <w:t>QuantConnect Lean &amp; QuickFIX (Quantitative &amp; Protocol Engines)</w:t>
+      </w:r>
+      <w:r>
+        <w:rPr>
+          <w:i/>
+          <w:sz w:val="15"/>
+        </w:rPr>
+        <w:t xml:space="preserve"> | C#, C++, Financial Systems</w:t>
+        <w:br/>
+      </w:r>
+      <w:r>
+        <w:rPr>
+          <w:color w:val="102A6B"/>
+          <w:sz w:val="15"/>
+        </w:rPr>
+        <w:t>[Lean &amp; QuickFIX]</w:t>
+      </w:r>
+    </w:p>
+    <w:p>
+      <w:pPr>
+        <w:spacing w:before="0" w:after="10" w:line="240" w:lineRule="auto"/>
+        <w:ind w:left="216"/>
+      </w:pPr>
+      <w:r>
+        <w:rPr>
+          <w:sz w:val="16"/>
+        </w:rPr>
+        <w:t>• Fixed non-USD futures cash adjustment in FutureSettlementModel and lunch-break market bar calculations in Lean; resolved socket initiator disconnect callback notification on session disconnect in QuickFIX.</w:t>
+      </w:r>
+    </w:p>
+    <w:p>
+      <w:pPr>
+        <w:spacing w:before="60" w:after="24" w:line="240" w:lineRule="auto"/>
+        <w:pBdr>
+          <w:bottom w:val="single" w:sz="4" w:space="1" w:color="CBD5E0"/>
+        </w:pBdr>
+      </w:pPr>
+      <w:r>
+        <w:rPr>
+          <w:rFonts w:ascii="Calibri" w:hAnsi="Calibri"/>
+          <w:b/>
+          <w:color w:val="0D1424"/>
+          <w:sz w:val="19"/>
         </w:rPr>
         <w:t>SELECTED ENGINEERING PROJECTS</w:t>
       </w:r>
     </w:p>
     <w:p>
       <w:pPr>
-        <w:spacing w:before="50" w:after="16" w:line="240" w:lineRule="auto"/>
+        <w:spacing w:before="36" w:after="10" w:line="240" w:lineRule="auto"/>
       </w:pPr>
       <w:r>
         <w:rPr>
           <w:b/>
-          <w:sz w:val="17"/>
+          <w:sz w:val="16"/>
+        </w:rPr>
+        <w:t>DontTrust — Application Security &amp; Attack-Surface Intelligence Platform</w:t>
+      </w:r>
+      <w:r>
+        <w:rPr>
+          <w:i/>
+          <w:sz w:val="15"/>
+        </w:rPr>
+        <w:t xml:space="preserve"> | TypeScript, Node.js, React 19, AST Analysis, Cytoscape.js, SARIF, Docker</w:t>
+        <w:br/>
+      </w:r>
+      <w:r>
+        <w:rPr>
+          <w:color w:val="102A6B"/>
+          <w:sz w:val="15"/>
+        </w:rPr>
+        <w:t>[GitHub: abhi-byte62/dontTrust]  [Demo: abhishekmr.vercel.app/donttrust]</w:t>
+      </w:r>
+    </w:p>
+    <w:p>
+      <w:pPr>
+        <w:spacing w:before="0" w:after="10" w:line="240" w:lineRule="auto"/>
+        <w:ind w:left="216"/>
+      </w:pPr>
+      <w:r>
+        <w:rPr>
+          <w:sz w:val="16"/>
+        </w:rPr>
+        <w:t>• Architected a distributed application security intelligence platform across 17 monorepo workspaces, achieving 100% precision on benchmark suites.</w:t>
+      </w:r>
+    </w:p>
+    <w:p>
+      <w:pPr>
+        <w:spacing w:before="0" w:after="10" w:line="240" w:lineRule="auto"/>
+        <w:ind w:left="216"/>
+      </w:pPr>
+      <w:r>
+        <w:rPr>
+          <w:sz w:val="16"/>
+        </w:rPr>
+        <w:t>• Built an AST JavaScript data-flow engine detecting DOM XSS without browser overhead; engineered multi-identity BOLA/IDOR verification matrix.</w:t>
+      </w:r>
+    </w:p>
+    <w:p>
+      <w:pPr>
+        <w:spacing w:before="0" w:after="10" w:line="240" w:lineRule="auto"/>
+        <w:ind w:left="216"/>
+      </w:pPr>
+      <w:r>
+        <w:rPr>
+          <w:sz w:val="16"/>
+        </w:rPr>
+        <w:t>• Constructed Attack-Surface Graph 2.0 with Cytoscape topology visualization, automated secret redaction, and SARIF v2.1.0 report generation.</w:t>
+      </w:r>
+    </w:p>
+    <w:p>
+      <w:pPr>
+        <w:spacing w:before="36" w:after="10" w:line="240" w:lineRule="auto"/>
+      </w:pPr>
+      <w:r>
+        <w:rPr>
+          <w:b/>
+          <w:sz w:val="16"/>
         </w:rPr>
         <w:t>StackLens — Website Architecture Inference &amp; Intelligence Engine</w:t>
       </w:r>
       <w:r>
         <w:rPr>
           <w:i/>
-          <w:sz w:val="16"/>
+          <w:sz w:val="15"/>
         </w:rPr>
         <w:t xml:space="preserve"> | Java 21, Spring Boot 3, RabbitMQ, PostgreSQL, Redis, React 19, TypeScript</w:t>
         <w:br/>
@@ -230,67 +427,43 @@
     </w:p>
     <w:p>
       <w:pPr>
-        <w:spacing w:before="0" w:after="16" w:line="240" w:lineRule="auto"/>
-        <w:ind w:left="259"/>
+        <w:spacing w:before="0" w:after="10" w:line="240" w:lineRule="auto"/>
+        <w:ind w:left="216"/>
       </w:pPr>
       <w:r>
         <w:rPr>
           <w:sz w:val="16"/>
         </w:rPr>
-        <w:t>• Architected an asynchronous multi-vector probe engine reverse-engineering public web applications across 200+ weighted signatures.</w:t>
+        <w:t>• Architected an asynchronous multi-vector probe engine reverse-engineering web architectures across 200+ signatures with RFC 1918 SSRF defense.</w:t>
       </w:r>
     </w:p>
     <w:p>
       <w:pPr>
-        <w:spacing w:before="0" w:after="16" w:line="240" w:lineRule="auto"/>
-        <w:ind w:left="259"/>
+        <w:spacing w:before="0" w:after="10" w:line="240" w:lineRule="auto"/>
+        <w:ind w:left="216"/>
       </w:pPr>
       <w:r>
         <w:rPr>
           <w:sz w:val="16"/>
         </w:rPr>
-        <w:t>• Implemented SSRF and DNS-rebinding perimeter defense by validating resolved target IPs against private RFC 1918 subnets prior to worker dispatch.</w:t>
+        <w:t>• Decoupled external crawlers from APIs via RabbitMQ &amp; Redis; synthesized PostgreSQL schemas and interactive DAG topologies.</w:t>
       </w:r>
     </w:p>
     <w:p>
       <w:pPr>
-        <w:spacing w:before="0" w:after="16" w:line="240" w:lineRule="auto"/>
-        <w:ind w:left="259"/>
-      </w:pPr>
-      <w:r>
-        <w:rPr>
-          <w:sz w:val="16"/>
-        </w:rPr>
-        <w:t>• Decoupled long-running external HTTP/TLS crawlers from client APIs using RabbitMQ message queues and Redis caching tiers.</w:t>
-      </w:r>
-    </w:p>
-    <w:p>
-      <w:pPr>
-        <w:spacing w:before="0" w:after="16" w:line="240" w:lineRule="auto"/>
-        <w:ind w:left="259"/>
-      </w:pPr>
-      <w:r>
-        <w:rPr>
-          <w:sz w:val="16"/>
-        </w:rPr>
-        <w:t>• Synthesized PostgreSQL DDL schemas and REST/GraphQL API contracts from detected access patterns with interactive DAG topology generation.</w:t>
-      </w:r>
-    </w:p>
-    <w:p>
-      <w:pPr>
-        <w:spacing w:before="50" w:after="16" w:line="240" w:lineRule="auto"/>
+        <w:spacing w:before="36" w:after="10" w:line="240" w:lineRule="auto"/>
       </w:pPr>
       <w:r>
         <w:rPr>
           <w:b/>
-          <w:sz w:val="17"/>
+          <w:sz w:val="16"/>
         </w:rPr>
         <w:t>LiquidityLens — Market Microstructure Simulator &amp; Matching Engine</w:t>
       </w:r>
       <w:r>
         <w:rPr>
           <w:i/>
-          <w:sz w:val="16"/>
+          <w:sz w:val="15"/>
         </w:rPr>
         <w:t xml:space="preserve"> | C++17, Python 3.10, FastAPI, Fixed-Point Math, Hawkes Processes, WebSockets</w:t>
         <w:br/>
@@ -305,67 +478,43 @@
     </w:p>
     <w:p>
       <w:pPr>
-        <w:spacing w:before="0" w:after="16" w:line="240" w:lineRule="auto"/>
-        <w:ind w:left="259"/>
+        <w:spacing w:before="0" w:after="10" w:line="240" w:lineRule="auto"/>
+        <w:ind w:left="216"/>
       </w:pPr>
       <w:r>
         <w:rPr>
           <w:sz w:val="16"/>
         </w:rPr>
-        <w:t>• Developed a deterministic C++17 limit order book (LOB) matching engine supporting 4.5M+ events/s with ~220ns match latency.</w:t>
+        <w:t>• Developed a deterministic C++17 LOB matching engine supporting 4.5M+ events/s with ~220ns match latency using int64_t fixed-point arithmetic.</w:t>
       </w:r>
     </w:p>
     <w:p>
       <w:pPr>
-        <w:spacing w:before="0" w:after="16" w:line="240" w:lineRule="auto"/>
-        <w:ind w:left="259"/>
+        <w:spacing w:before="0" w:after="10" w:line="240" w:lineRule="auto"/>
+        <w:ind w:left="216"/>
       </w:pPr>
       <w:r>
         <w:rPr>
           <w:sz w:val="16"/>
         </w:rPr>
-        <w:t>• Utilized int64_t fixed-point arithmetic across matching and accounting pipelines, eliminating IEEE-754 floating-point drift.</w:t>
+        <w:t>• Simulated Hawkes process order clusters, modeled FIFO queue priority across 10µs–500µs latency slips, and calculated adverse selection markouts.</w:t>
       </w:r>
     </w:p>
     <w:p>
       <w:pPr>
-        <w:spacing w:before="0" w:after="16" w:line="240" w:lineRule="auto"/>
-        <w:ind w:left="259"/>
-      </w:pPr>
-      <w:r>
-        <w:rPr>
-          <w:sz w:val="16"/>
-        </w:rPr>
-        <w:t>• Simulated clustered order arrival dynamics with synthetic Hawkes processes and modeled FIFO queue priority across 10µs–500µs latency slips.</w:t>
-      </w:r>
-    </w:p>
-    <w:p>
-      <w:pPr>
-        <w:spacing w:before="0" w:after="16" w:line="240" w:lineRule="auto"/>
-        <w:ind w:left="259"/>
-      </w:pPr>
-      <w:r>
-        <w:rPr>
-          <w:sz w:val="16"/>
-        </w:rPr>
-        <w:t>• Calculated zero look-ahead adverse selection markout curves at 10ms, 100ms, and 1s post-trade horizons; streamed L2 depth via WebSockets.</w:t>
-      </w:r>
-    </w:p>
-    <w:p>
-      <w:pPr>
-        <w:spacing w:before="50" w:after="16" w:line="240" w:lineRule="auto"/>
+        <w:spacing w:before="36" w:after="10" w:line="240" w:lineRule="auto"/>
       </w:pPr>
       <w:r>
         <w:rPr>
           <w:b/>
-          <w:sz w:val="17"/>
+          <w:sz w:val="16"/>
         </w:rPr>
         <w:t>TaskFlow — Real-Time Collaborative Kanban &amp; Distributed State Engine</w:t>
       </w:r>
       <w:r>
         <w:rPr>
           <w:i/>
-          <w:sz w:val="16"/>
+          <w:sz w:val="15"/>
         </w:rPr>
         <w:t xml:space="preserve"> | React 18, Node.js, PostgreSQL 17, Prisma ORM, Socket.io, TanStack Query</w:t>
         <w:br/>
@@ -380,8 +529,8 @@
     </w:p>
     <w:p>
       <w:pPr>
-        <w:spacing w:before="0" w:after="16" w:line="240" w:lineRule="auto"/>
-        <w:ind w:left="259"/>
+        <w:spacing w:before="0" w:after="10" w:line="240" w:lineRule="auto"/>
+        <w:ind w:left="216"/>
       </w:pPr>
       <w:r>
         <w:rPr>
@@ -392,94 +541,19 @@
     </w:p>
     <w:p>
       <w:pPr>
-        <w:spacing w:before="0" w:after="16" w:line="240" w:lineRule="auto"/>
-        <w:ind w:left="259"/>
+        <w:spacing w:before="0" w:after="10" w:line="240" w:lineRule="auto"/>
+        <w:ind w:left="216"/>
       </w:pPr>
       <w:r>
         <w:rPr>
           <w:sz w:val="16"/>
         </w:rPr>
-        <w:t>• Implemented fractional midpoint indexing for O(1) card drag reordering, preventing expensive cascading updates across database rows.</w:t>
+        <w:t>• Implemented fractional midpoint indexing for O(1) card drag reordering and room-scoped Socket.io state synchronization.</w:t>
       </w:r>
     </w:p>
     <w:p>
       <w:pPr>
-        <w:spacing w:before="0" w:after="16" w:line="240" w:lineRule="auto"/>
-        <w:ind w:left="259"/>
-      </w:pPr>
-      <w:r>
-        <w:rPr>
-          <w:sz w:val="16"/>
-        </w:rPr>
-        <w:t>• Integrated room-scoped Socket.io state synchronization with role-based access control (RBAC) enforced in atomic Prisma transactions.</w:t>
-      </w:r>
-    </w:p>
-    <w:p>
-      <w:pPr>
-        <w:spacing w:before="50" w:after="16" w:line="240" w:lineRule="auto"/>
-      </w:pPr>
-      <w:r>
-        <w:rPr>
-          <w:b/>
-          <w:sz w:val="17"/>
-        </w:rPr>
-        <w:t>Specter Proxy — Stream Backpressure &amp; Ephemeral TLS Interception Proxy</w:t>
-      </w:r>
-      <w:r>
-        <w:rPr>
-          <w:i/>
-          <w:sz w:val="16"/>
-        </w:rPr>
-        <w:t xml:space="preserve"> | Node.js Streams, HTTP/HTTPS, TLS Termination, Dynamic SNI, Backpressure</w:t>
-        <w:br/>
-      </w:r>
-      <w:r>
-        <w:rPr>
-          <w:color w:val="102A6B"/>
-          <w:sz w:val="15"/>
-        </w:rPr>
-        <w:t>[GitHub: abhi-byte62/specter-proxy]  [Demo: abhishekmr.vercel.app/specter-proxy]</w:t>
-      </w:r>
-    </w:p>
-    <w:p>
-      <w:pPr>
-        <w:spacing w:before="0" w:after="16" w:line="240" w:lineRule="auto"/>
-        <w:ind w:left="259"/>
-      </w:pPr>
-      <w:r>
-        <w:rPr>
-          <w:sz w:val="16"/>
-        </w:rPr>
-        <w:t>• Built a stream-oriented forward proxy for real-time packet inspection, latency injection, and synthetic network resilience testing.</w:t>
-      </w:r>
-    </w:p>
-    <w:p>
-      <w:pPr>
-        <w:spacing w:before="0" w:after="16" w:line="240" w:lineRule="auto"/>
-        <w:ind w:left="259"/>
-      </w:pPr>
-      <w:r>
-        <w:rPr>
-          <w:sz w:val="16"/>
-        </w:rPr>
-        <w:t>• Enforced strict highWaterMark stream backpressure flow control to prevent heap bloat, maintaining a bounded ~35MB memory footprint.</w:t>
-      </w:r>
-    </w:p>
-    <w:p>
-      <w:pPr>
-        <w:spacing w:before="0" w:after="16" w:line="240" w:lineRule="auto"/>
-        <w:ind w:left="259"/>
-      </w:pPr>
-      <w:r>
-        <w:rPr>
-          <w:sz w:val="16"/>
-        </w:rPr>
-        <w:t>• Implemented dynamic on-the-fly X.509 SNI certificate generation signed by an ephemeral local CA for seamless TLS MITM inspection.</w:t>
-      </w:r>
-    </w:p>
-    <w:p>
-      <w:pPr>
-        <w:spacing w:before="70" w:after="30" w:line="240" w:lineRule="auto"/>
+        <w:spacing w:before="60" w:after="24" w:line="240" w:lineRule="auto"/>
         <w:pBdr>
           <w:bottom w:val="single" w:sz="4" w:space="1" w:color="CBD5E0"/>
         </w:pBdr>
@@ -489,47 +563,47 @@
           <w:rFonts w:ascii="Calibri" w:hAnsi="Calibri"/>
           <w:b/>
           <w:color w:val="0D1424"/>
-          <w:sz w:val="20"/>
+          <w:sz w:val="19"/>
         </w:rPr>
         <w:t>EDUCATION</w:t>
       </w:r>
     </w:p>
     <w:p>
       <w:pPr>
-        <w:spacing w:before="30" w:after="16"/>
+        <w:spacing w:before="24" w:after="10"/>
       </w:pPr>
       <w:r>
         <w:rPr>
           <w:b/>
-          <w:sz w:val="17"/>
+          <w:sz w:val="16"/>
         </w:rPr>
         <w:t>Presidency University — Bengaluru, India</w:t>
       </w:r>
       <w:r>
         <w:rPr>
           <w:i/>
-          <w:sz w:val="16"/>
+          <w:sz w:val="15"/>
         </w:rPr>
         <w:t xml:space="preserve">  [Sept 2023 – Present | Expected 2027]</w:t>
         <w:br/>
       </w:r>
       <w:r>
         <w:rPr>
-          <w:sz w:val="17"/>
+          <w:sz w:val="16"/>
         </w:rPr>
         <w:t>Bachelor of Technology (B.Tech) in Computer Science &amp; Engineering</w:t>
         <w:br/>
       </w:r>
       <w:r>
         <w:rPr>
-          <w:sz w:val="16"/>
+          <w:sz w:val="15"/>
         </w:rPr>
         <w:t>Relevant Coursework: Data Structures &amp; Algorithms, Object-Oriented Programming, Operating Systems, Database Management Systems (DBMS), Computer Networks, System Design, Software Engineering.</w:t>
       </w:r>
     </w:p>
     <w:p>
       <w:pPr>
-        <w:spacing w:before="70" w:after="30" w:line="240" w:lineRule="auto"/>
+        <w:spacing w:before="60" w:after="24" w:line="240" w:lineRule="auto"/>
         <w:pBdr>
           <w:bottom w:val="single" w:sz="4" w:space="1" w:color="CBD5E0"/>
         </w:pBdr>
@@ -539,38 +613,38 @@
           <w:rFonts w:ascii="Calibri" w:hAnsi="Calibri"/>
           <w:b/>
           <w:color w:val="0D1424"/>
-          <w:sz w:val="20"/>
+          <w:sz w:val="19"/>
         </w:rPr>
         <w:t>PROBLEM SOLVING &amp; CERTIFICATIONS</w:t>
       </w:r>
     </w:p>
     <w:p>
       <w:pPr>
-        <w:spacing w:before="30" w:after="16"/>
-        <w:ind w:left="259"/>
+        <w:spacing w:before="20" w:after="10"/>
+        <w:ind w:left="216"/>
       </w:pPr>
       <w:r>
         <w:rPr>
-          <w:sz w:val="16"/>
+          <w:sz w:val="15"/>
         </w:rPr>
         <w:t>• Competitive Programming: Active problem solver on LeetCode (u/playboldAbhi) and Codeforces (playboldAbhi), focusing on Graph Algorithms, Dynamic Programming, and Amortized Complexity.</w:t>
       </w:r>
     </w:p>
     <w:p>
       <w:pPr>
-        <w:spacing w:before="0" w:after="30"/>
-        <w:ind w:left="259"/>
+        <w:spacing w:before="0" w:after="20"/>
+        <w:ind w:left="216"/>
       </w:pPr>
       <w:r>
         <w:rPr>
-          <w:sz w:val="16"/>
+          <w:sz w:val="15"/>
         </w:rPr>
         <w:t>• HackerRank Certifications: SQL (Advanced), Rest API (Intermediate), Problem Solving (Intermediate), Java (Basic).</w:t>
       </w:r>
     </w:p>
     <w:sectPr>
       <w:pgSz w:w="12240" w:h="15840"/>
-      <w:pgMar w:top="461" w:right="547" w:bottom="461" w:left="547" w:header="720" w:footer="720" w:gutter="0"/>
+      <w:pgMar w:top="403" w:right="504" w:bottom="403" w:left="504" w:header="720" w:footer="720" w:gutter="0"/>
       <w:cols w:space="720"/>
       <w:docGrid w:linePitch="360"/>
     </w:sectPr>
@@ -944,7 +1018,7 @@
     <w:rPr>
       <w:rFonts w:ascii="Calibri" w:hAnsi="Calibri"/>
       <w:color w:val="1A202C"/>
-      <w:sz w:val="18"/>
+      <w:sz w:val="17"/>
     </w:rPr>
   </w:style>
   <w:style w:type="paragraph" w:styleId="Header">

</xml_diff>